<commit_message>
Agrega rol Almacenero (BD, backend, tests y documentacion)
Nuevo rol con acceso exclusivo a Inventario (kardex) y consulta de
Productos, separado de Cajero (ventas) y Administrador (todo).

- BD: ENUM rol +Almacenero (schema.sql, schema_test.sql, migracion 003),
  seed con usuario de prueba almacen/almacen123
- Backend: Auth::esAlmacenero(), destino de login a Inventario,
  UsuarioController permite asignar Cajero/Almacenero desde Administrador
- Paginas: productos.php e inventario.php aceptan el nuevo rol, menu.php
  y usuarios.php reflejan el rol nuevo
- Tests: 7 nuevos casos (Auth, Login, UsuarioController), suite completa
  217/217 en verde
- Docs: los 6 documentos del curso y el diagrama de casos de uso
  actualizados con el rol y el caso de uso CU-14

Co-Authored-By: Claude Sonnet 5 <noreply@anthropic.com>
</commit_message>
<xml_diff>
--- a/docs/01_Documento_de_Requerimientos.docx
+++ b/docs/01_Documento_de_Requerimientos.docx
@@ -1,5 +1,29 @@
 
-<file path=word/document.xml><?xml version="1.0" encoding="utf-8"?>
+<file path=docProps\app.xml><?xml version="1.0" encoding="utf-8"?>
+<Properties xmlns="http://schemas.openxmlformats.org/officeDocument/2006/extended-properties" xmlns:vt="http://schemas.openxmlformats.org/officeDocument/2006/docPropsVTypes"/>
+</file>
+
+<file path=docProps\core.xml><?xml version="1.0" encoding="utf-8"?>
+<cp:coreProperties xmlns:cp="http://schemas.openxmlformats.org/package/2006/metadata/core-properties" xmlns:dc="http://purl.org/dc/elements/1.1/" xmlns:dcterms="http://purl.org/dc/terms/" xmlns:dcmitype="http://purl.org/dc/dcmitype/" xmlns:xsi="http://www.w3.org/2001/XMLSchema-instance">
+  <dc:title>Documento de Requerimientos</dc:title>
+  <dc:creator>Sistema Web para la Gestión de un Minimarket</dc:creator>
+  <dc:description>Proyecto final del curso de Desarrollo de Sistemas de Información</dc:description>
+  <cp:lastModifiedBy>Un-named</cp:lastModifiedBy>
+  <cp:revision>1</cp:revision>
+  <dcterms:created xsi:type="dcterms:W3CDTF">2026-08-27T02:20:19.833Z</dcterms:created>
+  <dcterms:modified xsi:type="dcterms:W3CDTF">2026-08-27T02:20:19.834Z</dcterms:modified>
+</cp:coreProperties>
+</file>
+
+<file path=docProps\custom.xml><?xml version="1.0" encoding="utf-8"?>
+<Properties xmlns="http://schemas.openxmlformats.org/officeDocument/2006/custom-properties" xmlns:vt="http://schemas.openxmlformats.org/officeDocument/2006/docPropsVTypes"/>
+</file>
+
+<file path=word\comments.xml><?xml version="1.0" encoding="utf-8"?>
+<w:comments xmlns:cx="http://schemas.microsoft.com/office/drawing/2014/chartex" xmlns:cx1="http://schemas.microsoft.com/office/drawing/2015/9/8/chartex" xmlns:cx2="http://schemas.microsoft.com/office/drawing/2015/10/21/chartex" xmlns:cx3="http://schemas.microsoft.com/office/drawing/2016/5/9/chartex" xmlns:cx4="http://schemas.microsoft.com/office/drawing/2016/5/10/chartex" xmlns:cx5="http://schemas.microsoft.com/office/drawing/2016/5/11/chartex" xmlns:cx6="http://schemas.microsoft.com/office/drawing/2016/5/12/chartex" xmlns:cx7="http://schemas.microsoft.com/office/drawing/2016/5/13/chartex" xmlns:cx8="http://schemas.microsoft.com/office/drawing/2016/5/14/chartex" xmlns:mc="http://schemas.openxmlformats.org/markup-compatibility/2006" xmlns:aink="http://schemas.microsoft.com/office/drawing/2016/ink" xmlns:am3d="http://schemas.microsoft.com/office/drawing/2017/model3d" xmlns:o="urn:schemas-microsoft-com:office:office" xmlns:r="http://schemas.openxmlformats.org/officeDocument/2006/relationships" xmlns:m="http://schemas.openxmlformats.org/officeDocument/2006/math" xmlns:v="urn:schemas-microsoft-com:vml" xmlns:wp14="http://schemas.microsoft.com/office/word/2010/wordprocessingDrawing" xmlns:wp="http://schemas.openxmlformats.org/drawingml/2006/wordprocessingDrawing" xmlns:w10="urn:schemas-microsoft-com:office:word" xmlns:w="http://schemas.openxmlformats.org/wordprocessingml/2006/main" xmlns:w14="http://schemas.microsoft.com/office/word/2010/wordml" xmlns:w15="http://schemas.microsoft.com/office/word/2012/wordml" xmlns:w16cex="http://schemas.microsoft.com/office/word/2018/wordml/cex" xmlns:w16cid="http://schemas.microsoft.com/office/word/2016/wordml/cid" xmlns:w16="http://schemas.microsoft.com/office/word/2018/wordml" xmlns:w16sdtdh="http://schemas.microsoft.com/office/word/2020/wordml/sdtdatahash" xmlns:w16se="http://schemas.microsoft.com/office/word/2015/wordml/symex" xmlns:wpg="http://schemas.microsoft.com/office/word/2010/wordprocessingGroup" xmlns:wpi="http://schemas.microsoft.com/office/word/2010/wordprocessingInk" xmlns:wne="http://schemas.microsoft.com/office/word/2006/wordml" xmlns:wps="http://schemas.microsoft.com/office/word/2010/wordprocessingShape"/>
+</file>
+
+<file path=word\document.xml><?xml version="1.0" encoding="utf-8"?>
 <w:document xmlns:wpc="http://schemas.microsoft.com/office/word/2010/wordprocessingCanvas" xmlns:mc="http://schemas.openxmlformats.org/markup-compatibility/2006" xmlns:o="urn:schemas-microsoft-com:office:office" xmlns:r="http://schemas.openxmlformats.org/officeDocument/2006/relationships" xmlns:m="http://schemas.openxmlformats.org/officeDocument/2006/math" xmlns:v="urn:schemas-microsoft-com:vml" xmlns:wp14="http://schemas.microsoft.com/office/word/2010/wordprocessingDrawing" xmlns:wp="http://schemas.openxmlformats.org/drawingml/2006/wordprocessingDrawing" xmlns:w10="urn:schemas-microsoft-com:office:word" xmlns:w="http://schemas.openxmlformats.org/wordprocessingml/2006/main" xmlns:w14="http://schemas.microsoft.com/office/word/2010/wordml" xmlns:w15="http://schemas.microsoft.com/office/word/2012/wordml" xmlns:wpg="http://schemas.microsoft.com/office/word/2010/wordprocessingGroup" xmlns:wpi="http://schemas.microsoft.com/office/word/2010/wordprocessingInk" xmlns:wne="http://schemas.microsoft.com/office/word/2006/wordml" xmlns:wps="http://schemas.microsoft.com/office/word/2010/wordprocessingShape" xmlns:cx="http://schemas.microsoft.com/office/drawing/2014/chartex" xmlns:cx1="http://schemas.microsoft.com/office/drawing/2015/9/8/chartex" xmlns:cx2="http://schemas.microsoft.com/office/drawing/2015/10/21/chartex" xmlns:cx3="http://schemas.microsoft.com/office/drawing/2016/5/9/chartex" xmlns:cx4="http://schemas.microsoft.com/office/drawing/2016/5/10/chartex" xmlns:cx5="http://schemas.microsoft.com/office/drawing/2016/5/11/chartex" xmlns:cx6="http://schemas.microsoft.com/office/drawing/2016/5/12/chartex" xmlns:cx7="http://schemas.microsoft.com/office/drawing/2016/5/13/chartex" xmlns:cx8="http://schemas.microsoft.com/office/drawing/2016/5/14/chartex" xmlns:aink="http://schemas.microsoft.com/office/drawing/2016/ink" xmlns:am3d="http://schemas.microsoft.com/office/drawing/2017/model3d" xmlns:w16cex="http://schemas.microsoft.com/office/word/2018/wordml/cex" xmlns:w16cid="http://schemas.microsoft.com/office/word/2016/wordml/cid" xmlns:w16="http://schemas.microsoft.com/office/word/2018/wordml" xmlns:w16sdtdh="http://schemas.microsoft.com/office/word/2020/wordml/sdtdatahash" xmlns:w16se="http://schemas.microsoft.com/office/word/2015/wordml/symex" mc:Ignorable="w14 w15 wp14">
   <w:body>
     <w:p>
@@ -1664,7 +1688,7 @@
           <w:sz w:val="22"/>
           <w:szCs w:val="22"/>
         </w:rPr>
-        <w:t xml:space="preserve">Se identificaron dos actores humanos y un actor no humano que interviene automáticamente en los procesos críticos.</w:t>
+        <w:t xml:space="preserve">Se identificaron tres actores humanos y un actor no humano que interviene automáticamente en los procesos críticos.</w:t>
       </w:r>
     </w:p>
     <w:tbl>
@@ -1860,6 +1884,66 @@
                 <w:szCs w:val="20"/>
               </w:rPr>
               <w:t xml:space="preserve">Personal de atención en caja. Registra las ventas, consulta el catálogo y el historial de sus propias ventas, y registra clientes nuevos. No puede modificar precios, stock ni anular comprobantes.</w:t>
+            </w:r>
+          </w:p>
+        </w:tc>
+      </w:tr>
+      <w:tr>
+        <w:tc>
+          <w:tcPr>
+            <w:tcW w:type="dxa" w:w="1986"/>
+            <w:shd w:fill="F1F5F9" w:color="auto" w:val="clear"/>
+            <w:tcMar>
+              <w:top w:type="dxa" w:w="80"/>
+              <w:left w:type="dxa" w:w="110"/>
+              <w:bottom w:type="dxa" w:w="80"/>
+              <w:right w:type="dxa" w:w="110"/>
+            </w:tcMar>
+            <w:vAlign w:val="center"/>
+          </w:tcPr>
+          <w:p>
+            <w:pPr>
+              <w:spacing w:after="0" w:line="260"/>
+              <w:jc w:val="left"/>
+            </w:pPr>
+            <w:r>
+              <w:rPr>
+                <w:b/>
+                <w:bCs/>
+                <w:color w:val="1F2937"/>
+                <w:sz w:val="20"/>
+                <w:szCs w:val="20"/>
+              </w:rPr>
+              <w:t xml:space="preserve">Almacenero</w:t>
+            </w:r>
+          </w:p>
+        </w:tc>
+        <w:tc>
+          <w:tcPr>
+            <w:tcW w:type="dxa" w:w="7040"/>
+            <w:shd w:fill="F1F5F9" w:color="auto" w:val="clear"/>
+            <w:tcMar>
+              <w:top w:type="dxa" w:w="80"/>
+              <w:left w:type="dxa" w:w="110"/>
+              <w:bottom w:type="dxa" w:w="80"/>
+              <w:right w:type="dxa" w:w="110"/>
+            </w:tcMar>
+            <w:vAlign w:val="center"/>
+          </w:tcPr>
+          <w:p>
+            <w:pPr>
+              <w:spacing w:after="0" w:line="260"/>
+              <w:jc w:val="left"/>
+            </w:pPr>
+            <w:r>
+              <w:rPr>
+                <w:b w:val="false"/>
+                <w:bCs w:val="false"/>
+                <w:color w:val="1F2937"/>
+                <w:sz w:val="20"/>
+                <w:szCs w:val="20"/>
+              </w:rPr>
+              <w:t xml:space="preserve">Personal encargado del control de stock. Registra entradas, salidas y ajustes de inventario, consulta el kardex y el catálogo de productos. No accede al punto de venta, a los reportes ni a la gestión de usuarios.</w:t>
             </w:r>
           </w:p>
         </w:tc>
@@ -2924,6 +3008,29 @@
         </w:tc>
       </w:tr>
     </w:tbl>
+    <w:p>
+      <w:pPr>
+        <w:spacing w:after="200" w:line="276" w:lineRule="auto"/>
+        <w:jc w:val="both"/>
+        <w:rPr>
+          <w:rFonts w:ascii="Poppins" w:hAnsi="Poppins" w:cs="Poppins"/>
+          <w:i/>
+          <w:iCs/>
+          <w:sz w:val="22"/>
+          <w:szCs w:val="22"/>
+        </w:rPr>
+      </w:pPr>
+      <w:r>
+        <w:rPr>
+          <w:rFonts w:ascii="Poppins" w:hAnsi="Poppins" w:cs="Poppins"/>
+          <w:i/>
+          <w:iCs/>
+          <w:sz w:val="22"/>
+          <w:szCs w:val="22"/>
+        </w:rPr>
+        <w:t xml:space="preserve">Nota: el rol Almacenero se incorporó tras la primera versión de esta matriz. Su alcance no se agregó como columna adicional a la tabla anterior para no alterar su formato original; en su lugar, se resume aquí: accede en exclusiva a Inventario y kardex (registrar entradas, salidas y ajustes; consultar el kardex) y a Catálogo de productos en modo de solo consulta (igual que el Cajero). No accede a Punto de venta, Historial de ventas, Anular venta, Categorías, Clientes, Dashboard, Reportes ni Usuarios.</w:t>
+      </w:r>
+    </w:p>
     <w:p>
       <w:r>
         <w:br w:type="page"/>
@@ -4461,7 +4568,7 @@
                 <w:sz w:val="20"/>
                 <w:szCs w:val="20"/>
               </w:rPr>
-              <w:t xml:space="preserve">Administrador, Cajero</w:t>
+              <w:t xml:space="preserve">Administrador, Cajero, Almacenero</w:t>
             </w:r>
           </w:p>
         </w:tc>
@@ -5084,7 +5191,7 @@
                 <w:sz w:val="20"/>
                 <w:szCs w:val="20"/>
               </w:rPr>
-              <w:t xml:space="preserve">Administrador</w:t>
+              <w:t xml:space="preserve">Administrador, Almacenero</w:t>
             </w:r>
           </w:p>
         </w:tc>
@@ -5230,7 +5337,7 @@
                 <w:sz w:val="20"/>
                 <w:szCs w:val="20"/>
               </w:rPr>
-              <w:t xml:space="preserve">Administrador</w:t>
+              <w:t xml:space="preserve">Administrador, Almacenero</w:t>
             </w:r>
           </w:p>
         </w:tc>
@@ -5373,7 +5480,7 @@
                 <w:sz w:val="20"/>
                 <w:szCs w:val="20"/>
               </w:rPr>
-              <w:t xml:space="preserve">Administrador</w:t>
+              <w:t xml:space="preserve">Administrador, Almacenero</w:t>
             </w:r>
           </w:p>
         </w:tc>
@@ -5519,7 +5626,7 @@
                 <w:sz w:val="20"/>
                 <w:szCs w:val="20"/>
               </w:rPr>
-              <w:t xml:space="preserve">Administrador</w:t>
+              <w:t xml:space="preserve">Administrador, Almacenero</w:t>
             </w:r>
           </w:p>
         </w:tc>
@@ -9616,7 +9723,7 @@
                 <w:sz w:val="20"/>
                 <w:szCs w:val="20"/>
               </w:rPr>
-              <w:t xml:space="preserve">El administrador debe poder registrar, editar, activar y desactivar usuarios, asignándoles el rol de administrador o de cajero.</w:t>
+              <w:t xml:space="preserve">El administrador debe poder registrar, editar, activar y desactivar usuarios, asignándoles el rol de administrador, de cajero o de almacenero.</w:t>
             </w:r>
           </w:p>
         </w:tc>
@@ -16217,11 +16324,7 @@
 </w:document>
 </file>
 
-<file path=word/comments.xml><?xml version="1.0" encoding="utf-8"?>
-<w:comments xmlns:cx="http://schemas.microsoft.com/office/drawing/2014/chartex" xmlns:cx1="http://schemas.microsoft.com/office/drawing/2015/9/8/chartex" xmlns:cx2="http://schemas.microsoft.com/office/drawing/2015/10/21/chartex" xmlns:cx3="http://schemas.microsoft.com/office/drawing/2016/5/9/chartex" xmlns:cx4="http://schemas.microsoft.com/office/drawing/2016/5/10/chartex" xmlns:cx5="http://schemas.microsoft.com/office/drawing/2016/5/11/chartex" xmlns:cx6="http://schemas.microsoft.com/office/drawing/2016/5/12/chartex" xmlns:cx7="http://schemas.microsoft.com/office/drawing/2016/5/13/chartex" xmlns:cx8="http://schemas.microsoft.com/office/drawing/2016/5/14/chartex" xmlns:mc="http://schemas.openxmlformats.org/markup-compatibility/2006" xmlns:aink="http://schemas.microsoft.com/office/drawing/2016/ink" xmlns:am3d="http://schemas.microsoft.com/office/drawing/2017/model3d" xmlns:o="urn:schemas-microsoft-com:office:office" xmlns:r="http://schemas.openxmlformats.org/officeDocument/2006/relationships" xmlns:m="http://schemas.openxmlformats.org/officeDocument/2006/math" xmlns:v="urn:schemas-microsoft-com:vml" xmlns:wp14="http://schemas.microsoft.com/office/word/2010/wordprocessingDrawing" xmlns:wp="http://schemas.openxmlformats.org/drawingml/2006/wordprocessingDrawing" xmlns:w10="urn:schemas-microsoft-com:office:word" xmlns:w="http://schemas.openxmlformats.org/wordprocessingml/2006/main" xmlns:w14="http://schemas.microsoft.com/office/word/2010/wordml" xmlns:w15="http://schemas.microsoft.com/office/word/2012/wordml" xmlns:w16cex="http://schemas.microsoft.com/office/word/2018/wordml/cex" xmlns:w16cid="http://schemas.microsoft.com/office/word/2016/wordml/cid" xmlns:w16="http://schemas.microsoft.com/office/word/2018/wordml" xmlns:w16sdtdh="http://schemas.microsoft.com/office/word/2020/wordml/sdtdatahash" xmlns:w16se="http://schemas.microsoft.com/office/word/2015/wordml/symex" xmlns:wpg="http://schemas.microsoft.com/office/word/2010/wordprocessingGroup" xmlns:wpi="http://schemas.microsoft.com/office/word/2010/wordprocessingInk" xmlns:wne="http://schemas.microsoft.com/office/word/2006/wordml" xmlns:wps="http://schemas.microsoft.com/office/word/2010/wordprocessingShape"/>
-</file>
-
-<file path=word/endnotes.xml><?xml version="1.0" encoding="utf-8"?>
+<file path=word\endnotes.xml><?xml version="1.0" encoding="utf-8"?>
 <w:endnotes xmlns:wpc="http://schemas.microsoft.com/office/word/2010/wordprocessingCanvas" xmlns:mc="http://schemas.openxmlformats.org/markup-compatibility/2006" xmlns:o="urn:schemas-microsoft-com:office:office" xmlns:r="http://schemas.openxmlformats.org/officeDocument/2006/relationships" xmlns:m="http://schemas.openxmlformats.org/officeDocument/2006/math" xmlns:v="urn:schemas-microsoft-com:vml" xmlns:wp14="http://schemas.microsoft.com/office/word/2010/wordprocessingDrawing" xmlns:wp="http://schemas.openxmlformats.org/drawingml/2006/wordprocessingDrawing" xmlns:w10="urn:schemas-microsoft-com:office:word" xmlns:w="http://schemas.openxmlformats.org/wordprocessingml/2006/main" xmlns:w14="http://schemas.microsoft.com/office/word/2010/wordml" xmlns:w15="http://schemas.microsoft.com/office/word/2012/wordml" xmlns:wpg="http://schemas.microsoft.com/office/word/2010/wordprocessingGroup" xmlns:wpi="http://schemas.microsoft.com/office/word/2010/wordprocessingInk" xmlns:wne="http://schemas.microsoft.com/office/word/2006/wordml" xmlns:wps="http://schemas.microsoft.com/office/word/2010/wordprocessingShape" mc:Ignorable="w14 w15 wp14">
   <w:endnote w:type="separator" w:id="-1">
     <w:p>
@@ -16258,7 +16361,11 @@
 </w:endnotes>
 </file>
 
-<file path=word/footer1.xml><?xml version="1.0" encoding="utf-8"?>
+<file path=word\fontTable.xml><?xml version="1.0" encoding="utf-8"?>
+<w:fonts xmlns:mc="http://schemas.openxmlformats.org/markup-compatibility/2006" xmlns:r="http://schemas.openxmlformats.org/officeDocument/2006/relationships" xmlns:w="http://schemas.openxmlformats.org/wordprocessingml/2006/main" xmlns:w14="http://schemas.microsoft.com/office/word/2010/wordml" xmlns:w15="http://schemas.microsoft.com/office/word/2012/wordml" xmlns:w16cex="http://schemas.microsoft.com/office/word/2018/wordml/cex" xmlns:w16cid="http://schemas.microsoft.com/office/word/2016/wordml/cid" xmlns:w16="http://schemas.microsoft.com/office/word/2018/wordml" xmlns:w16sdtdh="http://schemas.microsoft.com/office/word/2020/wordml/sdtdatahash" xmlns:w16se="http://schemas.microsoft.com/office/word/2015/wordml/symex" mc:Ignorable="w14 w15 w16se w16cid w16 w16cex w16sdtdh"/>
+</file>
+
+<file path=word\footer1.xml><?xml version="1.0" encoding="utf-8"?>
 <w:ftr xmlns:wpc="http://schemas.microsoft.com/office/word/2010/wordprocessingCanvas" xmlns:mc="http://schemas.openxmlformats.org/markup-compatibility/2006" xmlns:o="urn:schemas-microsoft-com:office:office" xmlns:r="http://schemas.openxmlformats.org/officeDocument/2006/relationships" xmlns:m="http://schemas.openxmlformats.org/officeDocument/2006/math" xmlns:v="urn:schemas-microsoft-com:vml" xmlns:wp14="http://schemas.microsoft.com/office/word/2010/wordprocessingDrawing" xmlns:wp="http://schemas.openxmlformats.org/drawingml/2006/wordprocessingDrawing" xmlns:w10="urn:schemas-microsoft-com:office:word" xmlns:w="http://schemas.openxmlformats.org/wordprocessingml/2006/main" xmlns:w14="http://schemas.microsoft.com/office/word/2010/wordml" xmlns:w15="http://schemas.microsoft.com/office/word/2012/wordml" xmlns:wpg="http://schemas.microsoft.com/office/word/2010/wordprocessingGroup" xmlns:wpi="http://schemas.microsoft.com/office/word/2010/wordprocessingInk" xmlns:wne="http://schemas.microsoft.com/office/word/2006/wordml" xmlns:wps="http://schemas.microsoft.com/office/word/2010/wordprocessingShape">
   <w:p>
     <w:pPr>
@@ -16285,13 +16392,13 @@
 </w:ftr>
 </file>
 
-<file path=word/footer2.xml><?xml version="1.0" encoding="utf-8"?>
+<file path=word\footer2.xml><?xml version="1.0" encoding="utf-8"?>
 <w:ftr xmlns:wpc="http://schemas.microsoft.com/office/word/2010/wordprocessingCanvas" xmlns:mc="http://schemas.openxmlformats.org/markup-compatibility/2006" xmlns:o="urn:schemas-microsoft-com:office:office" xmlns:r="http://schemas.openxmlformats.org/officeDocument/2006/relationships" xmlns:m="http://schemas.openxmlformats.org/officeDocument/2006/math" xmlns:v="urn:schemas-microsoft-com:vml" xmlns:wp14="http://schemas.microsoft.com/office/word/2010/wordprocessingDrawing" xmlns:wp="http://schemas.openxmlformats.org/drawingml/2006/wordprocessingDrawing" xmlns:w10="urn:schemas-microsoft-com:office:word" xmlns:w="http://schemas.openxmlformats.org/wordprocessingml/2006/main" xmlns:w14="http://schemas.microsoft.com/office/word/2010/wordml" xmlns:w15="http://schemas.microsoft.com/office/word/2012/wordml" xmlns:wpg="http://schemas.microsoft.com/office/word/2010/wordprocessingGroup" xmlns:wpi="http://schemas.microsoft.com/office/word/2010/wordprocessingInk" xmlns:wne="http://schemas.microsoft.com/office/word/2006/wordml" xmlns:wps="http://schemas.microsoft.com/office/word/2010/wordprocessingShape">
   <w:p/>
 </w:ftr>
 </file>
 
-<file path=word/footnotes.xml><?xml version="1.0" encoding="utf-8"?>
+<file path=word\footnotes.xml><?xml version="1.0" encoding="utf-8"?>
 <w:footnotes xmlns:wpc="http://schemas.microsoft.com/office/word/2010/wordprocessingCanvas" xmlns:mc="http://schemas.openxmlformats.org/markup-compatibility/2006" xmlns:o="urn:schemas-microsoft-com:office:office" xmlns:r="http://schemas.openxmlformats.org/officeDocument/2006/relationships" xmlns:m="http://schemas.openxmlformats.org/officeDocument/2006/math" xmlns:v="urn:schemas-microsoft-com:vml" xmlns:wp14="http://schemas.microsoft.com/office/word/2010/wordprocessingDrawing" xmlns:wp="http://schemas.openxmlformats.org/drawingml/2006/wordprocessingDrawing" xmlns:w10="urn:schemas-microsoft-com:office:word" xmlns:w="http://schemas.openxmlformats.org/wordprocessingml/2006/main" xmlns:w14="http://schemas.microsoft.com/office/word/2010/wordml" xmlns:w15="http://schemas.microsoft.com/office/word/2012/wordml" xmlns:wpg="http://schemas.microsoft.com/office/word/2010/wordprocessingGroup" xmlns:wpi="http://schemas.microsoft.com/office/word/2010/wordprocessingInk" xmlns:wne="http://schemas.microsoft.com/office/word/2006/wordml" xmlns:wps="http://schemas.microsoft.com/office/word/2010/wordprocessingShape" mc:Ignorable="w14 w15 wp14">
   <w:footnote w:type="separator" w:id="-1">
     <w:p>
@@ -16328,7 +16435,7 @@
 </w:footnotes>
 </file>
 
-<file path=word/header1.xml><?xml version="1.0" encoding="utf-8"?>
+<file path=word\header1.xml><?xml version="1.0" encoding="utf-8"?>
 <w:hdr xmlns:wpc="http://schemas.microsoft.com/office/word/2010/wordprocessingCanvas" xmlns:mc="http://schemas.openxmlformats.org/markup-compatibility/2006" xmlns:o="urn:schemas-microsoft-com:office:office" xmlns:r="http://schemas.openxmlformats.org/officeDocument/2006/relationships" xmlns:m="http://schemas.openxmlformats.org/officeDocument/2006/math" xmlns:v="urn:schemas-microsoft-com:vml" xmlns:wp14="http://schemas.microsoft.com/office/word/2010/wordprocessingDrawing" xmlns:wp="http://schemas.openxmlformats.org/drawingml/2006/wordprocessingDrawing" xmlns:w10="urn:schemas-microsoft-com:office:word" xmlns:w="http://schemas.openxmlformats.org/wordprocessingml/2006/main" xmlns:w14="http://schemas.microsoft.com/office/word/2010/wordml" xmlns:w15="http://schemas.microsoft.com/office/word/2012/wordml" xmlns:wpg="http://schemas.microsoft.com/office/word/2010/wordprocessingGroup" xmlns:wpi="http://schemas.microsoft.com/office/word/2010/wordprocessingInk" xmlns:wne="http://schemas.microsoft.com/office/word/2006/wordml" xmlns:wps="http://schemas.microsoft.com/office/word/2010/wordprocessingShape" xmlns:cx="http://schemas.microsoft.com/office/drawing/2014/chartex" xmlns:cx1="http://schemas.microsoft.com/office/drawing/2015/9/8/chartex" xmlns:cx2="http://schemas.microsoft.com/office/drawing/2015/10/21/chartex" xmlns:cx3="http://schemas.microsoft.com/office/drawing/2016/5/9/chartex" xmlns:cx4="http://schemas.microsoft.com/office/drawing/2016/5/10/chartex" xmlns:cx5="http://schemas.microsoft.com/office/drawing/2016/5/11/chartex" xmlns:cx6="http://schemas.microsoft.com/office/drawing/2016/5/12/chartex" xmlns:cx7="http://schemas.microsoft.com/office/drawing/2016/5/13/chartex" xmlns:cx8="http://schemas.microsoft.com/office/drawing/2016/5/14/chartex" xmlns:w16cid="http://schemas.microsoft.com/office/word/2016/wordml/cid" xmlns:w16se="http://schemas.microsoft.com/office/word/2015/wordml/symex">
   <w:p>
     <w:pPr>
@@ -16349,13 +16456,13 @@
 </w:hdr>
 </file>
 
-<file path=word/header2.xml><?xml version="1.0" encoding="utf-8"?>
+<file path=word\header2.xml><?xml version="1.0" encoding="utf-8"?>
 <w:hdr xmlns:wpc="http://schemas.microsoft.com/office/word/2010/wordprocessingCanvas" xmlns:mc="http://schemas.openxmlformats.org/markup-compatibility/2006" xmlns:o="urn:schemas-microsoft-com:office:office" xmlns:r="http://schemas.openxmlformats.org/officeDocument/2006/relationships" xmlns:m="http://schemas.openxmlformats.org/officeDocument/2006/math" xmlns:v="urn:schemas-microsoft-com:vml" xmlns:wp14="http://schemas.microsoft.com/office/word/2010/wordprocessingDrawing" xmlns:wp="http://schemas.openxmlformats.org/drawingml/2006/wordprocessingDrawing" xmlns:w10="urn:schemas-microsoft-com:office:word" xmlns:w="http://schemas.openxmlformats.org/wordprocessingml/2006/main" xmlns:w14="http://schemas.microsoft.com/office/word/2010/wordml" xmlns:w15="http://schemas.microsoft.com/office/word/2012/wordml" xmlns:wpg="http://schemas.microsoft.com/office/word/2010/wordprocessingGroup" xmlns:wpi="http://schemas.microsoft.com/office/word/2010/wordprocessingInk" xmlns:wne="http://schemas.microsoft.com/office/word/2006/wordml" xmlns:wps="http://schemas.microsoft.com/office/word/2010/wordprocessingShape" xmlns:cx="http://schemas.microsoft.com/office/drawing/2014/chartex" xmlns:cx1="http://schemas.microsoft.com/office/drawing/2015/9/8/chartex" xmlns:cx2="http://schemas.microsoft.com/office/drawing/2015/10/21/chartex" xmlns:cx3="http://schemas.microsoft.com/office/drawing/2016/5/9/chartex" xmlns:cx4="http://schemas.microsoft.com/office/drawing/2016/5/10/chartex" xmlns:cx5="http://schemas.microsoft.com/office/drawing/2016/5/11/chartex" xmlns:cx6="http://schemas.microsoft.com/office/drawing/2016/5/12/chartex" xmlns:cx7="http://schemas.microsoft.com/office/drawing/2016/5/13/chartex" xmlns:cx8="http://schemas.microsoft.com/office/drawing/2016/5/14/chartex" xmlns:w16cid="http://schemas.microsoft.com/office/word/2016/wordml/cid" xmlns:w16se="http://schemas.microsoft.com/office/word/2015/wordml/symex">
   <w:p/>
 </w:hdr>
 </file>
 
-<file path=word/numbering.xml><?xml version="1.0" encoding="utf-8"?>
+<file path=word\numbering.xml><?xml version="1.0" encoding="utf-8"?>
 <w:numbering xmlns:wpc="http://schemas.microsoft.com/office/word/2010/wordprocessingCanvas" xmlns:mc="http://schemas.openxmlformats.org/markup-compatibility/2006" xmlns:o="urn:schemas-microsoft-com:office:office" xmlns:r="http://schemas.openxmlformats.org/officeDocument/2006/relationships" xmlns:m="http://schemas.openxmlformats.org/officeDocument/2006/math" xmlns:v="urn:schemas-microsoft-com:vml" xmlns:wp14="http://schemas.microsoft.com/office/word/2010/wordprocessingDrawing" xmlns:wp="http://schemas.openxmlformats.org/drawingml/2006/wordprocessingDrawing" xmlns:w10="urn:schemas-microsoft-com:office:word" xmlns:w="http://schemas.openxmlformats.org/wordprocessingml/2006/main" xmlns:w14="http://schemas.microsoft.com/office/word/2010/wordml" xmlns:w15="http://schemas.microsoft.com/office/word/2012/wordml" xmlns:wpg="http://schemas.microsoft.com/office/word/2010/wordprocessingGroup" xmlns:wpi="http://schemas.microsoft.com/office/word/2010/wordprocessingInk" xmlns:wne="http://schemas.microsoft.com/office/word/2006/wordml" xmlns:wps="http://schemas.microsoft.com/office/word/2010/wordprocessingShape" mc:Ignorable="w14 w15 wp14">
   <w:abstractNum w:abstractNumId="1" w15:restartNumberingAfterBreak="0">
     <w:multiLevelType w:val="hybridMultilevel"/>
@@ -16477,7 +16584,17 @@
 </w:numbering>
 </file>
 
-<file path=word/styles.xml><?xml version="1.0" encoding="utf-8"?>
+<file path=word\settings.xml><?xml version="1.0" encoding="utf-8"?>
+<w:settings xmlns:wpc="http://schemas.microsoft.com/office/word/2010/wordprocessingCanvas" xmlns:mc="http://schemas.openxmlformats.org/markup-compatibility/2006" xmlns:o="urn:schemas-microsoft-com:office:office" xmlns:r="http://schemas.openxmlformats.org/officeDocument/2006/relationships" xmlns:m="http://schemas.openxmlformats.org/officeDocument/2006/math" xmlns:v="urn:schemas-microsoft-com:vml" xmlns:wp14="http://schemas.microsoft.com/office/word/2010/wordprocessingDrawing" xmlns:wp="http://schemas.openxmlformats.org/drawingml/2006/wordprocessingDrawing" xmlns:w10="urn:schemas-microsoft-com:office:word" xmlns:w="http://schemas.openxmlformats.org/wordprocessingml/2006/main" xmlns:w14="http://schemas.microsoft.com/office/word/2010/wordml" xmlns:w15="http://schemas.microsoft.com/office/word/2012/wordml" xmlns:wpg="http://schemas.microsoft.com/office/word/2010/wordprocessingGroup" xmlns:wpi="http://schemas.microsoft.com/office/word/2010/wordprocessingInk" xmlns:wne="http://schemas.microsoft.com/office/word/2006/wordml" xmlns:wps="http://schemas.microsoft.com/office/word/2010/wordprocessingShape" mc:Ignorable="w14 w15 wp14">
+  <w:displayBackgroundShape/>
+  <w:evenAndOddHeaders w:val="false"/>
+  <w:compat>
+    <w:compatSetting w:val="15" w:name="compatibilityMode" w:uri="http://schemas.microsoft.com/office/word"/>
+  </w:compat>
+</w:settings>
+</file>
+
+<file path=word\styles.xml><?xml version="1.0" encoding="utf-8"?>
 <w:styles xmlns:mc="http://schemas.openxmlformats.org/markup-compatibility/2006" xmlns:r="http://schemas.openxmlformats.org/officeDocument/2006/relationships" xmlns:w="http://schemas.openxmlformats.org/wordprocessingml/2006/main" xmlns:w14="http://schemas.microsoft.com/office/word/2010/wordml" xmlns:w15="http://schemas.microsoft.com/office/word/2012/wordml" mc:Ignorable="w14 w15">
   <w:docDefaults>
     <w:rPrDefault>

</xml_diff>

<commit_message>
Sincroniza multiples cambios (docs, diagramas, migraciones SQL, paginas)
</commit_message>
<xml_diff>
--- a/docs/01_Documento_de_Requerimientos.docx
+++ b/docs/01_Documento_de_Requerimientos.docx
@@ -17046,6 +17046,115 @@
       </w:tr>
     </w:tbl>
     <w:p/>
+    <w:p>
+      <w:r>
+        <w:br w:type="page"/>
+      </w:r>
+    </w:p>
+    <w:p>
+      <w:r>
+        <w:br w:type="page"/>
+      </w:r>
+    </w:p>
+    <w:p>
+      <w:r>
+        <w:br w:type="page"/>
+      </w:r>
+    </w:p>
+    <w:p>
+      <w:pPr>
+        <w:spacing w:before="0"/>
+      </w:pPr>
+      <w:r>
+        <w:rPr>
+          <w:b/>
+          <w:sz w:val="32"/>
+        </w:rPr>
+        <w:t>Actualización de documentación</w:t>
+      </w:r>
+    </w:p>
+    <w:p>
+      <w:pPr>
+        <w:spacing w:after="200"/>
+      </w:pPr>
+      <w:r>
+        <w:t>Esta sección registra los cambios incorporados al Sistema Web para la Gestión de un Minimarket después de la versión documentada inicialmente.</w:t>
+      </w:r>
+    </w:p>
+    <w:p>
+      <w:r>
+        <w:rPr>
+          <w:b/>
+          <w:sz w:val="26"/>
+        </w:rPr>
+        <w:t>3.9 Vista pública y catálogo consultable</w:t>
+      </w:r>
+    </w:p>
+    <w:p>
+      <w:pPr>
+        <w:ind w:left="360" w:hanging="200"/>
+      </w:pPr>
+      <w:r>
+        <w:t>• RF-29. El sistema debe ofrecer una portada pública con información comercial, horario, teléfono, dirección y accesos directos al catálogo y al contacto.</w:t>
+      </w:r>
+    </w:p>
+    <w:p>
+      <w:pPr>
+        <w:ind w:left="360" w:hanging="200"/>
+      </w:pPr>
+      <w:r>
+        <w:t>• RF-30. La vista pública debe mostrar categorías activas y productos disponibles obtenidos desde el catálogo del sistema.</w:t>
+      </w:r>
+    </w:p>
+    <w:p>
+      <w:pPr>
+        <w:ind w:left="360" w:hanging="200"/>
+      </w:pPr>
+      <w:r>
+        <w:t>• RF-31. El visitante debe poder buscar productos por nombre o código de barras y filtrar el catálogo por categoría sin iniciar sesión.</w:t>
+      </w:r>
+    </w:p>
+    <w:p>
+      <w:pPr>
+        <w:ind w:left="360" w:hanging="200"/>
+      </w:pPr>
+      <w:r>
+        <w:t>• RF-32. La información comercial publicada debe obtenerse de la configuración del negocio para evitar datos duplicados en las vistas públicas.</w:t>
+      </w:r>
+    </w:p>
+    <w:p>
+      <w:r>
+        <w:rPr>
+          <w:b/>
+          <w:sz w:val="26"/>
+        </w:rPr>
+        <w:t>3.10 Operación y continuidad</w:t>
+      </w:r>
+    </w:p>
+    <w:p>
+      <w:pPr>
+        <w:ind w:left="360" w:hanging="200"/>
+      </w:pPr>
+      <w:r>
+        <w:t>• RF-33. El usuario debe poder solicitar un enlace de recuperación de contraseña mediante el correo asociado a su cuenta.</w:t>
+      </w:r>
+    </w:p>
+    <w:p>
+      <w:pPr>
+        <w:ind w:left="360" w:hanging="200"/>
+      </w:pPr>
+      <w:r>
+        <w:t>• RF-34. El administrador debe poder configurar y generar respaldos de la base de datos, así como consultar los archivos generados.</w:t>
+      </w:r>
+    </w:p>
+    <w:p>
+      <w:pPr>
+        <w:ind w:left="360" w:hanging="200"/>
+      </w:pPr>
+      <w:r>
+        <w:t>• RF-35. El rol Almacenero debe consultar productos, inventario y kardex sin acceder a funciones administrativas o de venta.</w:t>
+      </w:r>
+    </w:p>
     <w:sectPr>
       <w:headerReference w:type="default" r:id="rId7"/>
       <w:footerReference w:type="default" r:id="rId8"/>

</xml_diff>